<commit_message>
Update explanatory note: add team members
</commit_message>
<xml_diff>
--- a/docs/Пояснительная_записка_MoodTracker.docx
+++ b/docs/Пояснительная_записка_MoodTracker.docx
@@ -201,7 +201,7 @@
           <w:sz w:val="24"/>
           <w:szCs w:val="24"/>
         </w:rPr>
-        <w:t xml:space="preserve">Разработал: студент группы БПМ-24-3</w:t>
+        <w:t xml:space="preserve">Разработали: студенты группы БПМ-24-3</w:t>
       </w:r>
     </w:p>
     <w:p>
@@ -216,6 +216,34 @@
           <w:szCs w:val="24"/>
         </w:rPr>
         <w:t xml:space="preserve">Сорвин М.С.</w:t>
+      </w:r>
+    </w:p>
+    <w:p>
+      <w:pPr>
+        <w:spacing w:line="240" w:lineRule="auto"/>
+        <w:jc w:val="right"/>
+      </w:pPr>
+      <w:r>
+        <w:rPr>
+          <w:rFonts w:ascii="Times New Roman" w:cs="Times New Roman" w:eastAsia="Times New Roman" w:hAnsi="Times New Roman"/>
+          <w:sz w:val="24"/>
+          <w:szCs w:val="24"/>
+        </w:rPr>
+        <w:t xml:space="preserve">Соломин И.А.</w:t>
+      </w:r>
+    </w:p>
+    <w:p>
+      <w:pPr>
+        <w:spacing w:line="240" w:lineRule="auto"/>
+        <w:jc w:val="right"/>
+      </w:pPr>
+      <w:r>
+        <w:rPr>
+          <w:rFonts w:ascii="Times New Roman" w:cs="Times New Roman" w:eastAsia="Times New Roman" w:hAnsi="Times New Roman"/>
+          <w:sz w:val="24"/>
+          <w:szCs w:val="24"/>
+        </w:rPr>
+        <w:t xml:space="preserve">Мартыненко А.Н.</w:t>
       </w:r>
     </w:p>
     <w:p>
@@ -4776,7 +4804,7 @@
         </w:rPr>
         <w:t xml:space="preserve">Репозиторий проекта: </w:t>
       </w:r>
-      <w:hyperlink w:history="1" r:id="rIdb0dw3z4xao7-q1by3wzg0">
+      <w:hyperlink w:history="1" r:id="rIduf3h2cj69gpfoykrcloil">
         <w:r>
           <w:rPr>
             <w:rStyle w:val="Hyperlink"/>

</xml_diff>